<commit_message>
Make Phase93 reproducible from raw data and refresh visual report
</commit_message>
<xml_diff>
--- a/docs/Round2_Phase93_端到端模型算法说明.docx
+++ b/docs/Round2_Phase93_端到端模型算法说明.docx
@@ -50,10 +50,13 @@
         <w:gridCol w:w="9792"/>
       </w:tblGrid>
       <w:tr>
+        <w:trPr>
+          <w:cantSplit w:val="true"/>
+        </w:trPr>
         <w:tc>
           <w:tcPr>
             <w:tcW w:type="dxa" w:w="9792"/>
-            <w:shd w:fill="FFF2CC"/>
+            <w:shd w:fill="E8EEF5"/>
           </w:tcPr>
           <w:p>
             <w:r>
@@ -77,7 +80,7 @@
                 <w:color w:val="0B2545"/>
                 <w:sz w:val="21"/>
               </w:rPr>
-              <w:t>端到端是指只从赛事授权的训练信道、训练位置和测试位置出发，所有能量缓存、频谱描述、空间特征、基础预测和后处理均可由代码生成。当前 R2-93 仓库的运行入口仍把 9 个历史派生数组作为 Release 前置资产，因此属于“冻结资产辅助重建”，不能直接宣称为纯原始数据的 bitwise 端到端复现。</w:t>
+              <w:t>当前 build_phase93_end_to_end.py 已改为严格 raw-to-final 入口：只读取赛事提供的训练信道、训练位置、测试位置和地图点云。train_energy、地图特征、矩形 OOF 折、PAS/PDP 标签、Phase4/5/6、P9、P10、Phase40 与 Phase93 均由代码现场生成；历史 Release 数组仅用于结果审计，不参与建模或推理。</w:t>
             </w:r>
           </w:p>
         </w:tc>
@@ -523,6 +526,9 @@
         <w:gridCol w:w="9792"/>
       </w:tblGrid>
       <w:tr>
+        <w:trPr>
+          <w:cantSplit w:val="true"/>
+        </w:trPr>
         <w:tc>
           <w:tcPr>
             <w:tcW w:type="dxa" w:w="9792"/>
@@ -624,6 +630,9 @@
         <w:gridCol w:w="9792"/>
       </w:tblGrid>
       <w:tr>
+        <w:trPr>
+          <w:cantSplit w:val="true"/>
+        </w:trPr>
         <w:tc>
           <w:tcPr>
             <w:tcW w:type="dxa" w:w="9792"/>
@@ -705,6 +714,9 @@
         <w:gridCol w:w="9792"/>
       </w:tblGrid>
       <w:tr>
+        <w:trPr>
+          <w:cantSplit w:val="true"/>
+        </w:trPr>
         <w:tc>
           <w:tcPr>
             <w:tcW w:type="dxa" w:w="9792"/>
@@ -786,6 +798,9 @@
         <w:gridCol w:w="9792"/>
       </w:tblGrid>
       <w:tr>
+        <w:trPr>
+          <w:cantSplit w:val="true"/>
+        </w:trPr>
         <w:tc>
           <w:tcPr>
             <w:tcW w:type="dxa" w:w="9792"/>
@@ -1207,6 +1222,88 @@
                 <w:b w:val="0"/>
                 <w:sz w:val="18"/>
               </w:rPr>
+              <w:t>Round2_Map.ply</w:t>
+            </w:r>
+          </w:p>
+        </w:tc>
+        <w:tc>
+          <w:tcPr>
+            <w:tcW w:type="dxa" w:w="2232"/>
+            <w:vAlign w:val="center"/>
+          </w:tcPr>
+          <w:p>
+            <w:pPr>
+              <w:spacing w:after="30"/>
+            </w:pPr>
+            <w:r/>
+            <w:r>
+              <w:rPr>
+                <w:rFonts w:ascii="Calibri" w:hAnsi="Calibri"/>
+                <w:b w:val="0"/>
+                <w:sz w:val="18"/>
+              </w:rPr>
+              <w:t>ASCII PLY，三维场景网格</w:t>
+            </w:r>
+          </w:p>
+        </w:tc>
+        <w:tc>
+          <w:tcPr>
+            <w:tcW w:type="dxa" w:w="1800"/>
+            <w:vAlign w:val="center"/>
+          </w:tcPr>
+          <w:p>
+            <w:pPr>
+              <w:spacing w:after="30"/>
+            </w:pPr>
+            <w:r/>
+            <w:r>
+              <w:rPr>
+                <w:rFonts w:ascii="Calibri" w:hAnsi="Calibri"/>
+                <w:b w:val="0"/>
+                <w:sz w:val="18"/>
+              </w:rPr>
+              <w:t>赛事原始数据</w:t>
+            </w:r>
+          </w:p>
+        </w:tc>
+        <w:tc>
+          <w:tcPr>
+            <w:tcW w:type="dxa" w:w="3672"/>
+            <w:vAlign w:val="center"/>
+          </w:tcPr>
+          <w:p>
+            <w:pPr>
+              <w:spacing w:after="30"/>
+            </w:pPr>
+            <w:r/>
+            <w:r>
+              <w:rPr>
+                <w:rFonts w:ascii="Calibri" w:hAnsi="Calibri"/>
+                <w:b w:val="0"/>
+                <w:sz w:val="18"/>
+              </w:rPr>
+              <w:t>生成 LOS、遮挡和局部环境特征</w:t>
+            </w:r>
+          </w:p>
+        </w:tc>
+      </w:tr>
+      <w:tr>
+        <w:tc>
+          <w:tcPr>
+            <w:tcW w:type="dxa" w:w="2088"/>
+            <w:vAlign w:val="center"/>
+          </w:tcPr>
+          <w:p>
+            <w:pPr>
+              <w:spacing w:after="30"/>
+            </w:pPr>
+            <w:r/>
+            <w:r>
+              <w:rPr>
+                <w:rFonts w:ascii="Calibri" w:hAnsi="Calibri"/>
+                <w:b w:val="0"/>
+                <w:sz w:val="18"/>
+              </w:rPr>
               <w:t>train_energy.npy</w:t>
             </w:r>
           </w:p>
@@ -1408,40 +1505,70 @@
     </w:p>
     <w:p>
       <w:pPr>
-        <w:pStyle w:val="ListNumber"/>
+        <w:ind w:left="317" w:hanging="317"/>
       </w:pPr>
+      <w:r>
+        <w:rPr>
+          <w:b/>
+        </w:rPr>
+        <w:t xml:space="preserve">1.  </w:t>
+      </w:r>
       <w:r>
         <w:t>使用测试位置在二维平面执行 DBSCAN（eps=10、min_samples=3），恢复官方测试岛标签和每个岛的包围矩形。</w:t>
       </w:r>
     </w:p>
     <w:p>
       <w:pPr>
-        <w:pStyle w:val="ListNumber"/>
+        <w:ind w:left="317" w:hanging="317"/>
       </w:pPr>
+      <w:r>
+        <w:rPr>
+          <w:b/>
+        </w:rPr>
+        <w:t xml:space="preserve">2.  </w:t>
+      </w:r>
       <w:r>
         <w:t>在训练点两侧分别选择矩形候选中心；宽、高和目标人口参考 TEST_BLOCKS，并乘 scale=0.75。</w:t>
       </w:r>
     </w:p>
     <w:p>
       <w:pPr>
-        <w:pStyle w:val="ListNumber"/>
+        <w:ind w:left="317" w:hanging="317"/>
       </w:pPr>
+      <w:r>
+        <w:rPr>
+          <w:b/>
+        </w:rPr>
+        <w:t xml:space="preserve">3.  </w:t>
+      </w:r>
       <w:r>
         <w:t>候选矩形内必须是非零信道点，并优先使实际人口接近目标人口；矩形之间不重叠。</w:t>
       </w:r>
     </w:p>
     <w:p>
       <w:pPr>
-        <w:pStyle w:val="ListNumber"/>
+        <w:ind w:left="317" w:hanging="317"/>
       </w:pPr>
+      <w:r>
+        <w:rPr>
+          <w:b/>
+        </w:rPr>
+        <w:t xml:space="preserve">4.  </w:t>
+      </w:r>
       <w:r>
         <w:t>每个验证矩形外再加 3 m buffer，从训练邻域中制造真实的空间缺口。</w:t>
       </w:r>
     </w:p>
     <w:p>
       <w:pPr>
-        <w:pStyle w:val="ListNumber"/>
+        <w:ind w:left="317" w:hanging="317"/>
       </w:pPr>
+      <w:r>
+        <w:rPr>
+          <w:b/>
+        </w:rPr>
+        <w:t xml:space="preserve">5.  </w:t>
+      </w:r>
       <w:r>
         <w:t>用固定种子 20260813+fold 构造 5 折；按官方各岛人口对折内样本加权。</w:t>
       </w:r>
@@ -1456,6 +1583,9 @@
         <w:gridCol w:w="9792"/>
       </w:tblGrid>
       <w:tr>
+        <w:trPr>
+          <w:cantSplit w:val="true"/>
+        </w:trPr>
         <w:tc>
           <w:tcPr>
             <w:tcW w:type="dxa" w:w="9792"/>
@@ -1667,6 +1797,9 @@
         <w:gridCol w:w="9792"/>
       </w:tblGrid>
       <w:tr>
+        <w:trPr>
+          <w:cantSplit w:val="true"/>
+        </w:trPr>
         <w:tc>
           <w:tcPr>
             <w:tcW w:type="dxa" w:w="9792"/>
@@ -2367,7 +2500,7 @@
         <w:pStyle w:val="Heading1"/>
       </w:pPr>
       <w:r>
-        <w:t>14. 当前仓库的复现边界（必须向赛事方说明）</w:t>
+        <w:t>14. 严格端到端复现边界</w:t>
       </w:r>
     </w:p>
     <w:tbl>
@@ -2390,7 +2523,7 @@
         </w:trPr>
         <w:tc>
           <w:tcPr>
-            <w:tcW w:type="dxa" w:w="2232"/>
+            <w:tcW w:type="dxa" w:w="1872"/>
             <w:vAlign w:val="center"/>
             <w:shd w:fill="F2F5F8"/>
           </w:tcPr>
@@ -2406,13 +2539,13 @@
                 <w:color w:val="0B2545"/>
                 <w:sz w:val="18"/>
               </w:rPr>
-              <w:t>复现方式</w:t>
+              <w:t>类别</w:t>
             </w:r>
           </w:p>
         </w:tc>
         <w:tc>
           <w:tcPr>
-            <w:tcW w:type="dxa" w:w="3024"/>
+            <w:tcW w:type="dxa" w:w="3528"/>
             <w:vAlign w:val="center"/>
             <w:shd w:fill="F2F5F8"/>
           </w:tcPr>
@@ -2428,13 +2561,13 @@
                 <w:color w:val="0B2545"/>
                 <w:sz w:val="18"/>
               </w:rPr>
-              <w:t>实际输入</w:t>
+              <w:t>实际内容</w:t>
             </w:r>
           </w:p>
         </w:tc>
         <w:tc>
           <w:tcPr>
-            <w:tcW w:type="dxa" w:w="2376"/>
+            <w:tcW w:type="dxa" w:w="1944"/>
             <w:vAlign w:val="center"/>
             <w:shd w:fill="F2F5F8"/>
           </w:tcPr>
@@ -2450,13 +2583,13 @@
                 <w:color w:val="0B2545"/>
                 <w:sz w:val="18"/>
               </w:rPr>
-              <w:t>是否纯原始数据端到端</w:t>
+              <w:t>是否作为模型输入</w:t>
             </w:r>
           </w:p>
         </w:tc>
         <w:tc>
           <w:tcPr>
-            <w:tcW w:type="dxa" w:w="2376"/>
+            <w:tcW w:type="dxa" w:w="2808"/>
             <w:vAlign w:val="center"/>
             <w:shd w:fill="F2F5F8"/>
           </w:tcPr>
@@ -2472,7 +2605,7 @@
                 <w:color w:val="0B2545"/>
                 <w:sz w:val="18"/>
               </w:rPr>
-              <w:t>适用场景</w:t>
+              <w:t>说明</w:t>
             </w:r>
           </w:p>
         </w:tc>
@@ -2480,7 +2613,7 @@
       <w:tr>
         <w:tc>
           <w:tcPr>
-            <w:tcW w:type="dxa" w:w="2232"/>
+            <w:tcW w:type="dxa" w:w="1872"/>
             <w:vAlign w:val="center"/>
           </w:tcPr>
           <w:p>
@@ -2494,13 +2627,13 @@
                 <w:b w:val="0"/>
                 <w:sz w:val="18"/>
               </w:rPr>
-              <w:t>当前 build_phase93_end_to_end.py</w:t>
+              <w:t>赛事原始输入</w:t>
             </w:r>
           </w:p>
         </w:tc>
         <w:tc>
           <w:tcPr>
-            <w:tcW w:type="dxa" w:w="3024"/>
+            <w:tcW w:type="dxa" w:w="3528"/>
             <w:vAlign w:val="center"/>
           </w:tcPr>
           <w:p>
@@ -2514,13 +2647,95 @@
                 <w:b w:val="0"/>
                 <w:sz w:val="18"/>
               </w:rPr>
-              <w:t>3 个赛事原始数组 + train_energy + 9 个 Release 派生数组</w:t>
+              <w:t>Train_Channel、Train_Pos、Test_Pos、Map.ply</w:t>
             </w:r>
           </w:p>
         </w:tc>
         <w:tc>
           <w:tcPr>
-            <w:tcW w:type="dxa" w:w="2376"/>
+            <w:tcW w:type="dxa" w:w="1944"/>
+            <w:vAlign w:val="center"/>
+          </w:tcPr>
+          <w:p>
+            <w:pPr>
+              <w:spacing w:after="30"/>
+            </w:pPr>
+            <w:r/>
+            <w:r>
+              <w:rPr>
+                <w:rFonts w:ascii="Calibri" w:hAnsi="Calibri"/>
+                <w:b w:val="0"/>
+                <w:sz w:val="18"/>
+              </w:rPr>
+              <w:t>是</w:t>
+            </w:r>
+          </w:p>
+        </w:tc>
+        <w:tc>
+          <w:tcPr>
+            <w:tcW w:type="dxa" w:w="2808"/>
+            <w:vAlign w:val="center"/>
+          </w:tcPr>
+          <w:p>
+            <w:pPr>
+              <w:spacing w:after="30"/>
+            </w:pPr>
+            <w:r/>
+            <w:r>
+              <w:rPr>
+                <w:rFonts w:ascii="Calibri" w:hAnsi="Calibri"/>
+                <w:b w:val="0"/>
+                <w:sz w:val="18"/>
+              </w:rPr>
+              <w:t>四个文件放在仓库根目录</w:t>
+            </w:r>
+          </w:p>
+        </w:tc>
+      </w:tr>
+      <w:tr>
+        <w:tc>
+          <w:tcPr>
+            <w:tcW w:type="dxa" w:w="1872"/>
+            <w:vAlign w:val="center"/>
+          </w:tcPr>
+          <w:p>
+            <w:pPr>
+              <w:spacing w:after="30"/>
+            </w:pPr>
+            <w:r/>
+            <w:r>
+              <w:rPr>
+                <w:rFonts w:ascii="Calibri" w:hAnsi="Calibri"/>
+                <w:b w:val="0"/>
+                <w:sz w:val="18"/>
+              </w:rPr>
+              <w:t>现场生成缓存</w:t>
+            </w:r>
+          </w:p>
+        </w:tc>
+        <w:tc>
+          <w:tcPr>
+            <w:tcW w:type="dxa" w:w="3528"/>
+            <w:vAlign w:val="center"/>
+          </w:tcPr>
+          <w:p>
+            <w:pPr>
+              <w:spacing w:after="30"/>
+            </w:pPr>
+            <w:r/>
+            <w:r>
+              <w:rPr>
+                <w:rFonts w:ascii="Calibri" w:hAnsi="Calibri"/>
+                <w:b w:val="0"/>
+                <w:sz w:val="18"/>
+              </w:rPr>
+              <w:t>energy、map features、矩形折、PAS/PDP、各阶段 OOF/test 数组</w:t>
+            </w:r>
+          </w:p>
+        </w:tc>
+        <w:tc>
+          <w:tcPr>
+            <w:tcW w:type="dxa" w:w="1944"/>
             <w:vAlign w:val="center"/>
           </w:tcPr>
           <w:p>
@@ -2540,7 +2755,7 @@
         </w:tc>
         <w:tc>
           <w:tcPr>
-            <w:tcW w:type="dxa" w:w="2376"/>
+            <w:tcW w:type="dxa" w:w="2808"/>
             <w:vAlign w:val="center"/>
           </w:tcPr>
           <w:p>
@@ -2554,7 +2769,7 @@
                 <w:b w:val="0"/>
                 <w:sz w:val="18"/>
               </w:rPr>
-              <w:t>重建 P9→P10→Phase40→Phase93；验证最终 SHA</w:t>
+              <w:t>均可删除后重算；不是提交前置资产</w:t>
             </w:r>
           </w:p>
         </w:tc>
@@ -2562,7 +2777,7 @@
       <w:tr>
         <w:tc>
           <w:tcPr>
-            <w:tcW w:type="dxa" w:w="2232"/>
+            <w:tcW w:type="dxa" w:w="1872"/>
             <w:vAlign w:val="center"/>
           </w:tcPr>
           <w:p>
@@ -2576,13 +2791,13 @@
                 <w:b w:val="0"/>
                 <w:sz w:val="18"/>
               </w:rPr>
-              <w:t>IncludeReferenceOutputs</w:t>
+              <w:t>固定模型定义</w:t>
             </w:r>
           </w:p>
         </w:tc>
         <w:tc>
           <w:tcPr>
-            <w:tcW w:type="dxa" w:w="3024"/>
+            <w:tcW w:type="dxa" w:w="3528"/>
             <w:vAlign w:val="center"/>
           </w:tcPr>
           <w:p>
@@ -2596,13 +2811,95 @@
                 <w:b w:val="0"/>
                 <w:sz w:val="18"/>
               </w:rPr>
-              <w:t>直接下载 P9/P10/Phase40/Phase93 参考数组</w:t>
+              <w:t>源码、随机种子、超参数、分组规则和选择配置</w:t>
             </w:r>
           </w:p>
         </w:tc>
         <w:tc>
           <w:tcPr>
-            <w:tcW w:type="dxa" w:w="2376"/>
+            <w:tcW w:type="dxa" w:w="1944"/>
+            <w:vAlign w:val="center"/>
+          </w:tcPr>
+          <w:p>
+            <w:pPr>
+              <w:spacing w:after="30"/>
+            </w:pPr>
+            <w:r/>
+            <w:r>
+              <w:rPr>
+                <w:rFonts w:ascii="Calibri" w:hAnsi="Calibri"/>
+                <w:b w:val="0"/>
+                <w:sz w:val="18"/>
+              </w:rPr>
+              <w:t>是</w:t>
+            </w:r>
+          </w:p>
+        </w:tc>
+        <w:tc>
+          <w:tcPr>
+            <w:tcW w:type="dxa" w:w="2808"/>
+            <w:vAlign w:val="center"/>
+          </w:tcPr>
+          <w:p>
+            <w:pPr>
+              <w:spacing w:after="30"/>
+            </w:pPr>
+            <w:r/>
+            <w:r>
+              <w:rPr>
+                <w:rFonts w:ascii="Calibri" w:hAnsi="Calibri"/>
+                <w:b w:val="0"/>
+                <w:sz w:val="18"/>
+              </w:rPr>
+              <w:t>属于可审计的算法与模型参数</w:t>
+            </w:r>
+          </w:p>
+        </w:tc>
+      </w:tr>
+      <w:tr>
+        <w:tc>
+          <w:tcPr>
+            <w:tcW w:type="dxa" w:w="1872"/>
+            <w:vAlign w:val="center"/>
+          </w:tcPr>
+          <w:p>
+            <w:pPr>
+              <w:spacing w:after="30"/>
+            </w:pPr>
+            <w:r/>
+            <w:r>
+              <w:rPr>
+                <w:rFonts w:ascii="Calibri" w:hAnsi="Calibri"/>
+                <w:b w:val="0"/>
+                <w:sz w:val="18"/>
+              </w:rPr>
+              <w:t>历史 Release 输出</w:t>
+            </w:r>
+          </w:p>
+        </w:tc>
+        <w:tc>
+          <w:tcPr>
+            <w:tcW w:type="dxa" w:w="3528"/>
+            <w:vAlign w:val="center"/>
+          </w:tcPr>
+          <w:p>
+            <w:pPr>
+              <w:spacing w:after="30"/>
+            </w:pPr>
+            <w:r/>
+            <w:r>
+              <w:rPr>
+                <w:rFonts w:ascii="Calibri" w:hAnsi="Calibri"/>
+                <w:b w:val="0"/>
+                <w:sz w:val="18"/>
+              </w:rPr>
+              <w:t>Phase6/P9/P10/Phase40/Phase93 参考 npy</w:t>
+            </w:r>
+          </w:p>
+        </w:tc>
+        <w:tc>
+          <w:tcPr>
+            <w:tcW w:type="dxa" w:w="1944"/>
             <w:vAlign w:val="center"/>
           </w:tcPr>
           <w:p>
@@ -2622,7 +2919,7 @@
         </w:tc>
         <w:tc>
           <w:tcPr>
-            <w:tcW w:type="dxa" w:w="2376"/>
+            <w:tcW w:type="dxa" w:w="2808"/>
             <w:vAlign w:val="center"/>
           </w:tcPr>
           <w:p>
@@ -2636,89 +2933,7 @@
                 <w:b w:val="0"/>
                 <w:sz w:val="18"/>
               </w:rPr>
-              <w:t>只做字节级比对，不是模型复现</w:t>
-            </w:r>
-          </w:p>
-        </w:tc>
-      </w:tr>
-      <w:tr>
-        <w:tc>
-          <w:tcPr>
-            <w:tcW w:type="dxa" w:w="2232"/>
-            <w:vAlign w:val="center"/>
-          </w:tcPr>
-          <w:p>
-            <w:pPr>
-              <w:spacing w:after="30"/>
-            </w:pPr>
-            <w:r/>
-            <w:r>
-              <w:rPr>
-                <w:rFonts w:ascii="Calibri" w:hAnsi="Calibri"/>
-                <w:b w:val="0"/>
-                <w:sz w:val="18"/>
-              </w:rPr>
-              <w:t>严格 raw-to-Phase93</w:t>
-            </w:r>
-          </w:p>
-        </w:tc>
-        <w:tc>
-          <w:tcPr>
-            <w:tcW w:type="dxa" w:w="3024"/>
-            <w:vAlign w:val="center"/>
-          </w:tcPr>
-          <w:p>
-            <w:pPr>
-              <w:spacing w:after="30"/>
-            </w:pPr>
-            <w:r/>
-            <w:r>
-              <w:rPr>
-                <w:rFonts w:ascii="Calibri" w:hAnsi="Calibri"/>
-                <w:b w:val="0"/>
-                <w:sz w:val="18"/>
-              </w:rPr>
-              <w:t>仅赛事原始数组；所有缓存和模型均现场生成</w:t>
-            </w:r>
-          </w:p>
-        </w:tc>
-        <w:tc>
-          <w:tcPr>
-            <w:tcW w:type="dxa" w:w="2376"/>
-            <w:vAlign w:val="center"/>
-          </w:tcPr>
-          <w:p>
-            <w:pPr>
-              <w:spacing w:after="30"/>
-            </w:pPr>
-            <w:r/>
-            <w:r>
-              <w:rPr>
-                <w:rFonts w:ascii="Calibri" w:hAnsi="Calibri"/>
-                <w:b w:val="0"/>
-                <w:sz w:val="18"/>
-              </w:rPr>
-              <w:t>当前仓库尚未形成单一可运行入口</w:t>
-            </w:r>
-          </w:p>
-        </w:tc>
-        <w:tc>
-          <w:tcPr>
-            <w:tcW w:type="dxa" w:w="2376"/>
-            <w:vAlign w:val="center"/>
-          </w:tcPr>
-          <w:p>
-            <w:pPr>
-              <w:spacing w:after="30"/>
-            </w:pPr>
-            <w:r/>
-            <w:r>
-              <w:rPr>
-                <w:rFonts w:ascii="Calibri" w:hAnsi="Calibri"/>
-                <w:b w:val="0"/>
-                <w:sz w:val="18"/>
-              </w:rPr>
-              <w:t>赛事方要求完整模型验证时应提交</w:t>
+              <w:t>只用于 SHA/数值对照，入口不会下载或读取</w:t>
             </w:r>
           </w:p>
         </w:tc>
@@ -2739,10 +2954,13 @@
         <w:gridCol w:w="9792"/>
       </w:tblGrid>
       <w:tr>
+        <w:trPr>
+          <w:cantSplit w:val="true"/>
+        </w:trPr>
         <w:tc>
           <w:tcPr>
             <w:tcW w:type="dxa" w:w="9792"/>
-            <w:shd w:fill="FFF2CC"/>
+            <w:shd w:fill="E8EEF5"/>
           </w:tcPr>
           <w:p>
             <w:r>
@@ -2758,7 +2976,7 @@
                 <w:color w:val="D96C32"/>
                 <w:sz w:val="21"/>
               </w:rPr>
-              <w:t>缺口清单：</w:t>
+              <w:t>一键入口：</w:t>
             </w:r>
             <w:r>
               <w:rPr>
@@ -2766,7 +2984,7 @@
                 <w:color w:val="0B2545"/>
                 <w:sz w:val="21"/>
               </w:rPr>
-              <w:t>要满足严格端到端，还需把 los_map_features、rich_map_features、tree/RBF PAS、Phase6 test base、Phase10 group-composite target 等历史派生资产的生成脚本、冻结配置和调用顺序统一接入 raw-to-Phase93 入口。若环境点云/地图是这些特征的原始来源，也必须由赛事方数据包提供或随模型提交其确定性生成器。</w:t>
+              <w:t>运行 python build_phase93_end_to_end.py。入口顺序执行 57 个确定性阶段，并支持 --list-stages 查看完整计划、--from-stage &lt;name&gt; 在中断后复用已有缓存继续。最终写出 500×256×4×192 的 complex64 Phase93 文件及 raw_end_to_end manifest。</w:t>
             </w:r>
           </w:p>
         </w:tc>
@@ -2932,6 +3150,48 @@
                 <w:sz w:val="18"/>
               </w:rPr>
               <w:t>原始数据读取、能量、矩形验证、指标、分岛邻域与频谱投影基础算子</w:t>
+            </w:r>
+          </w:p>
+        </w:tc>
+      </w:tr>
+      <w:tr>
+        <w:tc>
+          <w:tcPr>
+            <w:tcW w:type="dxa" w:w="4680"/>
+            <w:vAlign w:val="center"/>
+          </w:tcPr>
+          <w:p>
+            <w:pPr>
+              <w:spacing w:after="30"/>
+            </w:pPr>
+            <w:r/>
+            <w:r>
+              <w:rPr>
+                <w:rFonts w:ascii="Calibri" w:hAnsi="Calibri"/>
+                <w:b w:val="0"/>
+                <w:sz w:val="18"/>
+              </w:rPr>
+              <w:t>build_phase93_from_raw.py</w:t>
+            </w:r>
+          </w:p>
+        </w:tc>
+        <w:tc>
+          <w:tcPr>
+            <w:tcW w:type="dxa" w:w="5112"/>
+            <w:vAlign w:val="center"/>
+          </w:tcPr>
+          <w:p>
+            <w:pPr>
+              <w:spacing w:after="30"/>
+            </w:pPr>
+            <w:r/>
+            <w:r>
+              <w:rPr>
+                <w:rFonts w:ascii="Calibri" w:hAnsi="Calibri"/>
+                <w:b w:val="0"/>
+                <w:sz w:val="18"/>
+              </w:rPr>
+              <w:t>四个原始文件到 Phase93 的 57 阶段编排、恢复运行与最终验收</w:t>
             </w:r>
           </w:p>
         </w:tc>

</xml_diff>